<commit_message>
Corrige acentuacao no Word processo_dispositivos_passivos_glpi
</commit_message>
<xml_diff>
--- a/documentações/Processos/docx/processo_dispositivos_passivos_glpi.docx
+++ b/documentações/Processos/docx/processo_dispositivos_passivos_glpi.docx
@@ -41,7 +41,7 @@
           <w:color w:val="5E6B78"/>
           <w:sz w:val="19"/>
         </w:rPr>
-        <w:t>Ãrea responsÃ¡vel e versÃ£o conforme documentaÃ§Ã£o institucional</w:t>
+        <w:t>Área responsável e versão conforme documentação institucional</w:t>
       </w:r>
     </w:p>
     <w:p>
@@ -1348,40 +1348,7 @@
         <w:keepNext/>
         <w:jc w:val="center"/>
       </w:pPr>
-      <w:r>
-        <w:drawing>
-          <wp:inline xmlns:a="http://schemas.openxmlformats.org/drawingml/2006/main" xmlns:pic="http://schemas.openxmlformats.org/drawingml/2006/picture">
-            <wp:extent cx="5623560" cy="2807028"/>
-            <wp:docPr id="1" name="Picture 1"/>
-            <wp:cNvGraphicFramePr>
-              <a:graphicFrameLocks noChangeAspect="1"/>
-            </wp:cNvGraphicFramePr>
-            <a:graphic>
-              <a:graphicData uri="http://schemas.openxmlformats.org/drawingml/2006/picture">
-                <pic:pic>
-                  <pic:nvPicPr>
-                    <pic:cNvPr id="0" name="processo_dispositivos_passivos_glpi_1.png"/>
-                    <pic:cNvPicPr/>
-                  </pic:nvPicPr>
-                  <pic:blipFill>
-                    <a:blip r:embed="rId11"/>
-                    <a:stretch>
-                      <a:fillRect/>
-                    </a:stretch>
-                  </pic:blipFill>
-                  <pic:spPr>
-                    <a:xfrm>
-                      <a:off x="0" y="0"/>
-                      <a:ext cx="5623560" cy="2807028"/>
-                    </a:xfrm>
-                    <a:prstGeom prst="rect"/>
-                  </pic:spPr>
-                </pic:pic>
-              </a:graphicData>
-            </a:graphic>
-          </wp:inline>
-        </w:drawing>
-      </w:r>
+      <w:r/>
     </w:p>
     <w:p>
       <w:pPr>
@@ -2230,40 +2197,7 @@
         <w:keepNext/>
         <w:jc w:val="center"/>
       </w:pPr>
-      <w:r>
-        <w:drawing>
-          <wp:inline xmlns:a="http://schemas.openxmlformats.org/drawingml/2006/main" xmlns:pic="http://schemas.openxmlformats.org/drawingml/2006/picture">
-            <wp:extent cx="5623560" cy="2988334"/>
-            <wp:docPr id="2" name="Picture 2"/>
-            <wp:cNvGraphicFramePr>
-              <a:graphicFrameLocks noChangeAspect="1"/>
-            </wp:cNvGraphicFramePr>
-            <a:graphic>
-              <a:graphicData uri="http://schemas.openxmlformats.org/drawingml/2006/picture">
-                <pic:pic>
-                  <pic:nvPicPr>
-                    <pic:cNvPr id="0" name="processo_dispositivos_passivos_glpi_2.png"/>
-                    <pic:cNvPicPr/>
-                  </pic:nvPicPr>
-                  <pic:blipFill>
-                    <a:blip r:embed="rId12"/>
-                    <a:stretch>
-                      <a:fillRect/>
-                    </a:stretch>
-                  </pic:blipFill>
-                  <pic:spPr>
-                    <a:xfrm>
-                      <a:off x="0" y="0"/>
-                      <a:ext cx="5623560" cy="2988334"/>
-                    </a:xfrm>
-                    <a:prstGeom prst="rect"/>
-                  </pic:spPr>
-                </pic:pic>
-              </a:graphicData>
-            </a:graphic>
-          </wp:inline>
-        </w:drawing>
-      </w:r>
+      <w:r/>
     </w:p>
     <w:p>
       <w:pPr>
@@ -2285,40 +2219,7 @@
         <w:keepNext/>
         <w:jc w:val="center"/>
       </w:pPr>
-      <w:r>
-        <w:drawing>
-          <wp:inline xmlns:a="http://schemas.openxmlformats.org/drawingml/2006/main" xmlns:pic="http://schemas.openxmlformats.org/drawingml/2006/picture">
-            <wp:extent cx="2773680" cy="792480"/>
-            <wp:docPr id="3" name="Picture 3"/>
-            <wp:cNvGraphicFramePr>
-              <a:graphicFrameLocks noChangeAspect="1"/>
-            </wp:cNvGraphicFramePr>
-            <a:graphic>
-              <a:graphicData uri="http://schemas.openxmlformats.org/drawingml/2006/picture">
-                <pic:pic>
-                  <pic:nvPicPr>
-                    <pic:cNvPr id="0" name="processo_dispositivos_passivos_glpi_3.png"/>
-                    <pic:cNvPicPr/>
-                  </pic:nvPicPr>
-                  <pic:blipFill>
-                    <a:blip r:embed="rId13"/>
-                    <a:stretch>
-                      <a:fillRect/>
-                    </a:stretch>
-                  </pic:blipFill>
-                  <pic:spPr>
-                    <a:xfrm>
-                      <a:off x="0" y="0"/>
-                      <a:ext cx="2773680" cy="792480"/>
-                    </a:xfrm>
-                    <a:prstGeom prst="rect"/>
-                  </pic:spPr>
-                </pic:pic>
-              </a:graphicData>
-            </a:graphic>
-          </wp:inline>
-        </w:drawing>
-      </w:r>
+      <w:r/>
     </w:p>
     <w:p>
       <w:pPr>
@@ -3069,40 +2970,7 @@
         <w:keepNext/>
         <w:jc w:val="center"/>
       </w:pPr>
-      <w:r>
-        <w:drawing>
-          <wp:inline xmlns:a="http://schemas.openxmlformats.org/drawingml/2006/main" xmlns:pic="http://schemas.openxmlformats.org/drawingml/2006/picture">
-            <wp:extent cx="5623560" cy="3349911"/>
-            <wp:docPr id="4" name="Picture 4"/>
-            <wp:cNvGraphicFramePr>
-              <a:graphicFrameLocks noChangeAspect="1"/>
-            </wp:cNvGraphicFramePr>
-            <a:graphic>
-              <a:graphicData uri="http://schemas.openxmlformats.org/drawingml/2006/picture">
-                <pic:pic>
-                  <pic:nvPicPr>
-                    <pic:cNvPr id="0" name="processo_dispositivos_passivos_glpi_4.png"/>
-                    <pic:cNvPicPr/>
-                  </pic:nvPicPr>
-                  <pic:blipFill>
-                    <a:blip r:embed="rId14"/>
-                    <a:stretch>
-                      <a:fillRect/>
-                    </a:stretch>
-                  </pic:blipFill>
-                  <pic:spPr>
-                    <a:xfrm>
-                      <a:off x="0" y="0"/>
-                      <a:ext cx="5623560" cy="3349911"/>
-                    </a:xfrm>
-                    <a:prstGeom prst="rect"/>
-                  </pic:spPr>
-                </pic:pic>
-              </a:graphicData>
-            </a:graphic>
-          </wp:inline>
-        </w:drawing>
-      </w:r>
+      <w:r/>
     </w:p>
     <w:p>
       <w:pPr>
@@ -3124,40 +2992,7 @@
         <w:keepNext/>
         <w:jc w:val="center"/>
       </w:pPr>
-      <w:r>
-        <w:drawing>
-          <wp:inline xmlns:a="http://schemas.openxmlformats.org/drawingml/2006/main" xmlns:pic="http://schemas.openxmlformats.org/drawingml/2006/picture">
-            <wp:extent cx="5623560" cy="2813366"/>
-            <wp:docPr id="5" name="Picture 5"/>
-            <wp:cNvGraphicFramePr>
-              <a:graphicFrameLocks noChangeAspect="1"/>
-            </wp:cNvGraphicFramePr>
-            <a:graphic>
-              <a:graphicData uri="http://schemas.openxmlformats.org/drawingml/2006/picture">
-                <pic:pic>
-                  <pic:nvPicPr>
-                    <pic:cNvPr id="0" name="processo_dispositivos_passivos_glpi_5.png"/>
-                    <pic:cNvPicPr/>
-                  </pic:nvPicPr>
-                  <pic:blipFill>
-                    <a:blip r:embed="rId15"/>
-                    <a:stretch>
-                      <a:fillRect/>
-                    </a:stretch>
-                  </pic:blipFill>
-                  <pic:spPr>
-                    <a:xfrm>
-                      <a:off x="0" y="0"/>
-                      <a:ext cx="5623560" cy="2813366"/>
-                    </a:xfrm>
-                    <a:prstGeom prst="rect"/>
-                  </pic:spPr>
-                </pic:pic>
-              </a:graphicData>
-            </a:graphic>
-          </wp:inline>
-        </w:drawing>
-      </w:r>
+      <w:r/>
     </w:p>
     <w:p>
       <w:pPr>
@@ -4063,6 +3898,8 @@
     <w:sectPr>
       <w:headerReference w:type="default" r:id="rId9"/>
       <w:footerReference w:type="default" r:id="rId10"/>
+      <w:headerReference w:type="first" r:id="rId16"/>
+      <w:footerReference w:type="first" r:id="rId17"/>
       <w:pgSz w:w="12240" w:h="15840"/>
       <w:pgMar w:top="1080" w:right="1123" w:bottom="1080" w:left="1123" w:header="504" w:footer="504" w:gutter="0"/>
       <w:cols w:space="720"/>
@@ -4085,7 +3922,7 @@
         <w:color w:val="5E6B78"/>
         <w:sz w:val="17"/>
       </w:rPr>
-      <w:t xml:space="preserve">Secretaria de SaÃºde do Recife  |  </w:t>
+      <w:t xml:space="preserve">Secretaria de Saúde do Recife  |  </w:t>
     </w:r>
     <w:r>
       <w:rPr>
@@ -4093,9 +3930,19 @@
         <w:color w:val="5E6B78"/>
         <w:sz w:val="18"/>
       </w:rPr>
-      <w:t xml:space="preserve">PÃ¡gina </w:t>
+      <w:t xml:space="preserve">Página </w:t>
     </w:r>
     <w:fldSimple w:instr="PAGE"/>
+  </w:p>
+</w:ftr>
+</file>
+
+<file path=word/footer2.xml><?xml version="1.0" encoding="utf-8"?>
+<w:ftr xmlns:m="http://schemas.openxmlformats.org/officeDocument/2006/math" xmlns:mc="http://schemas.openxmlformats.org/markup-compatibility/2006" xmlns:mo="http://schemas.microsoft.com/office/mac/office/2008/main" xmlns:mv="urn:schemas-microsoft-com:mac:vml" xmlns:o="urn:schemas-microsoft-com:office:office" xmlns:r="http://schemas.openxmlformats.org/officeDocument/2006/relationships" xmlns:v="urn:schemas-microsoft-com:vml" xmlns:w10="urn:schemas-microsoft-com:office:word" xmlns:w14="http://schemas.microsoft.com/office/word/2010/wordml" xmlns:w="http://schemas.openxmlformats.org/wordprocessingml/2006/main" xmlns:wne="http://schemas.microsoft.com/office/word/2006/wordml" xmlns:wp14="http://schemas.microsoft.com/office/word/2010/wordprocessingDrawing" xmlns:wp="http://schemas.openxmlformats.org/drawingml/2006/wordprocessingDrawing" xmlns:wpc="http://schemas.microsoft.com/office/word/2010/wordprocessingCanvas" xmlns:wpg="http://schemas.microsoft.com/office/word/2010/wordprocessingGroup" xmlns:wpi="http://schemas.microsoft.com/office/word/2010/wordprocessingInk" xmlns:wps="http://schemas.microsoft.com/office/word/2010/wordprocessingShape" mc:Ignorable="w14 wp14">
+  <w:p>
+    <w:pPr>
+      <w:pStyle w:val="Footer"/>
+    </w:pPr>
   </w:p>
 </w:ftr>
 </file>
@@ -4114,8 +3961,18 @@
         <w:color w:val="5E6B78"/>
         <w:sz w:val="17"/>
       </w:rPr>
-      <w:t>SAÃšDE DIGITAL ATENDE  |  PROCESSO OPERACIONAL</w:t>
+      <w:t>SAÚDE DIGITAL ATENDE  |  PROCESSO OPERACIONAL</w:t>
     </w:r>
+  </w:p>
+</w:hdr>
+</file>
+
+<file path=word/header2.xml><?xml version="1.0" encoding="utf-8"?>
+<w:hdr xmlns:m="http://schemas.openxmlformats.org/officeDocument/2006/math" xmlns:mc="http://schemas.openxmlformats.org/markup-compatibility/2006" xmlns:mo="http://schemas.microsoft.com/office/mac/office/2008/main" xmlns:mv="urn:schemas-microsoft-com:mac:vml" xmlns:o="urn:schemas-microsoft-com:office:office" xmlns:r="http://schemas.openxmlformats.org/officeDocument/2006/relationships" xmlns:v="urn:schemas-microsoft-com:vml" xmlns:w10="urn:schemas-microsoft-com:office:word" xmlns:w14="http://schemas.microsoft.com/office/word/2010/wordml" xmlns:w="http://schemas.openxmlformats.org/wordprocessingml/2006/main" xmlns:wne="http://schemas.microsoft.com/office/word/2006/wordml" xmlns:wp14="http://schemas.microsoft.com/office/word/2010/wordprocessingDrawing" xmlns:wp="http://schemas.openxmlformats.org/drawingml/2006/wordprocessingDrawing" xmlns:wpc="http://schemas.microsoft.com/office/word/2010/wordprocessingCanvas" xmlns:wpg="http://schemas.microsoft.com/office/word/2010/wordprocessingGroup" xmlns:wpi="http://schemas.microsoft.com/office/word/2010/wordprocessingInk" xmlns:wps="http://schemas.microsoft.com/office/word/2010/wordprocessingShape" mc:Ignorable="w14 wp14">
+  <w:p>
+    <w:pPr>
+      <w:pStyle w:val="Header"/>
+    </w:pPr>
   </w:p>
 </w:hdr>
 </file>

</xml_diff>

<commit_message>
Atualiza Word padronizado processo_dispositivos_passivos_glpi
</commit_message>
<xml_diff>
--- a/documentações/Processos/docx/processo_dispositivos_passivos_glpi.docx
+++ b/documentações/Processos/docx/processo_dispositivos_passivos_glpi.docx
@@ -375,7 +375,7 @@
         <w:pStyle w:val="Heading1"/>
       </w:pPr>
       <w:r>
-        <w:t>Objetivo e escopo</w:t>
+        <w:t>Objetivo</w:t>
       </w:r>
     </w:p>
     <w:p>
@@ -423,7 +423,7 @@
         <w:pStyle w:val="Heading1"/>
       </w:pPr>
       <w:r>
-        <w:t>Processo 1 Abertura, diagnóstico e encerramento</w:t>
+        <w:t>Processo 1 - Abertura, diagnóstico e encerramento</w:t>
       </w:r>
     </w:p>
     <w:tbl>
@@ -1370,7 +1370,7 @@
         <w:pStyle w:val="Heading1"/>
       </w:pPr>
       <w:r>
-        <w:t>Processo 2 Abertura e relacionamento do novo chamado</w:t>
+        <w:t>Processo 2 - Abertura e relacionamento do novo chamado</w:t>
       </w:r>
     </w:p>
     <w:tbl>
@@ -2241,7 +2241,7 @@
         <w:pStyle w:val="Heading1"/>
       </w:pPr>
       <w:r>
-        <w:t>Processo 3 Estoque, Transferência / Liberação e retorno</w:t>
+        <w:t>Processo 3 - Estoque, Transferência / Liberação e retorno</w:t>
       </w:r>
     </w:p>
     <w:tbl>
@@ -3014,7 +3014,7 @@
         <w:pStyle w:val="Heading1"/>
       </w:pPr>
       <w:r>
-        <w:t>Processo 4 Entrega e conclusão</w:t>
+        <w:t>Processo 4 - Entrega e conclusão</w:t>
       </w:r>
     </w:p>
     <w:tbl>
@@ -3661,7 +3661,7 @@
         <w:pStyle w:val="Heading1"/>
       </w:pPr>
       <w:r>
-        <w:t>Histórico de Revisões</w:t>
+        <w:t>Histórico de Revisão</w:t>
       </w:r>
     </w:p>
     <w:tbl>

</xml_diff>